<commit_message>
Fixed few errors in VLSM table
</commit_message>
<xml_diff>
--- a/VLSM.docx
+++ b/VLSM.docx
@@ -1591,9 +1591,6 @@
               <w:jc w:val="center"/>
               <w:cnfStyle w:val="000000100000" w:firstRow="0" w:lastRow="0" w:firstColumn="0" w:lastColumn="0" w:oddVBand="0" w:evenVBand="0" w:oddHBand="1" w:evenHBand="0" w:firstRowFirstColumn="0" w:firstRowLastColumn="0" w:lastRowFirstColumn="0" w:lastRowLastColumn="0"/>
             </w:pPr>
-            <w:r>
-              <w:t>WAN</w:t>
-            </w:r>
           </w:p>
         </w:tc>
         <w:tc>
@@ -1725,9 +1722,6 @@
               <w:jc w:val="center"/>
               <w:cnfStyle w:val="000000000000" w:firstRow="0" w:lastRow="0" w:firstColumn="0" w:lastColumn="0" w:oddVBand="0" w:evenVBand="0" w:oddHBand="0" w:evenHBand="0" w:firstRowFirstColumn="0" w:firstRowLastColumn="0" w:lastRowFirstColumn="0" w:lastRowLastColumn="0"/>
             </w:pPr>
-            <w:r>
-              <w:t>WAN</w:t>
-            </w:r>
           </w:p>
         </w:tc>
         <w:tc>
@@ -1862,9 +1856,6 @@
               <w:jc w:val="center"/>
               <w:cnfStyle w:val="000000100000" w:firstRow="0" w:lastRow="0" w:firstColumn="0" w:lastColumn="0" w:oddVBand="0" w:evenVBand="0" w:oddHBand="1" w:evenHBand="0" w:firstRowFirstColumn="0" w:firstRowLastColumn="0" w:lastRowFirstColumn="0" w:lastRowLastColumn="0"/>
             </w:pPr>
-            <w:r>
-              <w:t>WAN</w:t>
-            </w:r>
           </w:p>
         </w:tc>
         <w:tc>
@@ -1996,9 +1987,6 @@
               <w:jc w:val="center"/>
               <w:cnfStyle w:val="000000000000" w:firstRow="0" w:lastRow="0" w:firstColumn="0" w:lastColumn="0" w:oddVBand="0" w:evenVBand="0" w:oddHBand="0" w:evenHBand="0" w:firstRowFirstColumn="0" w:firstRowLastColumn="0" w:lastRowFirstColumn="0" w:lastRowLastColumn="0"/>
             </w:pPr>
-            <w:r>
-              <w:t>WAN</w:t>
-            </w:r>
           </w:p>
         </w:tc>
         <w:tc>
@@ -2133,9 +2121,6 @@
               <w:jc w:val="center"/>
               <w:cnfStyle w:val="000000100000" w:firstRow="0" w:lastRow="0" w:firstColumn="0" w:lastColumn="0" w:oddVBand="0" w:evenVBand="0" w:oddHBand="1" w:evenHBand="0" w:firstRowFirstColumn="0" w:firstRowLastColumn="0" w:lastRowFirstColumn="0" w:lastRowLastColumn="0"/>
             </w:pPr>
-            <w:r>
-              <w:t>WAN</w:t>
-            </w:r>
           </w:p>
         </w:tc>
         <w:tc>
@@ -2267,9 +2252,6 @@
               <w:jc w:val="center"/>
               <w:cnfStyle w:val="000000000000" w:firstRow="0" w:lastRow="0" w:firstColumn="0" w:lastColumn="0" w:oddVBand="0" w:evenVBand="0" w:oddHBand="0" w:evenHBand="0" w:firstRowFirstColumn="0" w:firstRowLastColumn="0" w:lastRowFirstColumn="0" w:lastRowLastColumn="0"/>
             </w:pPr>
-            <w:r>
-              <w:t>WAN</w:t>
-            </w:r>
           </w:p>
         </w:tc>
         <w:tc>
@@ -3036,6 +3018,7 @@
   <w:style w:type="character" w:default="1" w:styleId="DefaultParagraphFont">
     <w:name w:val="Default Paragraph Font"/>
     <w:uiPriority w:val="1"/>
+    <w:semiHidden/>
     <w:unhideWhenUsed/>
   </w:style>
   <w:style w:type="table" w:default="1" w:styleId="TableNormal">

</xml_diff>